<commit_message>
fix: corrigir type error TemplateContext + templates Bloco 2
- Adiciona apenas_lidiane e apenas_alcione ao tipo TemplateContext
  (causava build error no Vercel após commit d729c79)
- Corrige bordas visíveis nas tabelas de assinatura 2 colunas:
  remove tcBorders do XML e aplica tblBorders val=none color=auto
- Corrige colapso de colunas no Google Docs e Mac: migra de
  WidthType.PERCENTAGE para DXA absoluto (4819/9638 twips) e
  corrige tblGrid gerado pela lib (w=100 → w=4819)
- Melhora espaçamento nos blocos de assinatura dos contratos
- Migra termo_representacao_inss de tab-stops para tabela 2 cols
- Remove cor vermelha (FF0000) da declaracao_hipossuficiencia
- Adiciona script de validação com 6 cenários (19/19 OK)

Co-Authored-By: Claude Sonnet 4.6 <noreply@anthropic.com>
</commit_message>
<xml_diff>
--- a/templates/01_contrato_bpc_adulto.docx
+++ b/templates/01_contrato_bpc_adulto.docx
@@ -2061,7 +2061,7 @@
     </w:p>
     <w:p>
       <w:pPr>
-        <w:spacing w:after="400"/>
+        <w:spacing w:after="720"/>
       </w:pPr>
     </w:p>
     <w:p>
@@ -2137,34 +2137,28 @@
     <w:tbl>
       <w:tblPr>
         <w:tblW w:type="dxa" w:w="9638"/>
+        <w:tblLayout w:type="fixed"/>
         <w:tblBorders>
-          <w:top w:val="none" w:color="FFFFFF" w:sz="0"/>
-          <w:left w:val="none" w:color="FFFFFF" w:sz="0"/>
-          <w:bottom w:val="none" w:color="FFFFFF" w:sz="0"/>
-          <w:right w:val="none" w:color="FFFFFF" w:sz="0"/>
-          <w:insideH w:val="single" w:color="auto" w:sz="4"/>
-          <w:insideV w:val="single" w:color="auto" w:sz="4"/>
+          <w:top w:val="none" w:sz="0" w:space="0" w:color="auto"/>
+          <w:left w:val="none" w:sz="0" w:space="0" w:color="auto"/>
+          <w:bottom w:val="none" w:sz="0" w:space="0" w:color="auto"/>
+          <w:right w:val="none" w:sz="0" w:space="0" w:color="auto"/>
+          <w:insideH w:val="none" w:sz="0" w:space="0" w:color="auto"/>
+          <w:insideV w:val="none" w:sz="0" w:space="0" w:color="auto"/>
         </w:tblBorders>
       </w:tblPr>
       <w:tblGrid>
-        <w:gridCol w:w="100"/>
-        <w:gridCol w:w="100"/>
-        <w:gridCol w:w="100"/>
+        <w:gridCol w:w="4819"/>
+        <w:gridCol w:w="4819"/>
       </w:tblGrid>
       <w:tr>
         <w:tc>
           <w:tcPr>
-            <w:tcW w:type="dxa" w:w="4519"/>
-            <w:tcBorders>
-              <w:top w:val="none" w:color="FFFFFF" w:sz="0"/>
-              <w:left w:val="none" w:color="FFFFFF" w:sz="0"/>
-              <w:bottom w:val="none" w:color="FFFFFF" w:sz="0"/>
-              <w:right w:val="none" w:color="FFFFFF" w:sz="0"/>
-            </w:tcBorders>
+            <w:tcW w:type="dxa" w:w="4819"/>
           </w:tcPr>
           <w:p>
             <w:pPr>
-              <w:spacing w:after="40"/>
+              <w:spacing w:after="80"/>
               <w:jc w:val="left"/>
             </w:pPr>
             <w:r>
@@ -2177,7 +2171,7 @@
           </w:p>
           <w:p>
             <w:pPr>
-              <w:spacing w:after="40"/>
+              <w:spacing w:after="80"/>
               <w:jc w:val="left"/>
             </w:pPr>
             <w:r>
@@ -2190,7 +2184,7 @@
           </w:p>
           <w:p>
             <w:pPr>
-              <w:spacing w:after="40"/>
+              <w:spacing w:after="80"/>
               <w:jc w:val="left"/>
             </w:pPr>
             <w:r>
@@ -2204,41 +2198,11 @@
         </w:tc>
         <w:tc>
           <w:tcPr>
-            <w:tcW w:type="dxa" w:w="600"/>
-            <w:tcBorders>
-              <w:top w:val="none" w:color="FFFFFF" w:sz="0"/>
-              <w:left w:val="none" w:color="FFFFFF" w:sz="0"/>
-              <w:bottom w:val="none" w:color="FFFFFF" w:sz="0"/>
-              <w:right w:val="none" w:color="FFFFFF" w:sz="0"/>
-            </w:tcBorders>
+            <w:tcW w:type="dxa" w:w="4819"/>
           </w:tcPr>
           <w:p>
             <w:pPr>
-              <w:spacing w:after="40"/>
-              <w:jc w:val="left"/>
-            </w:pPr>
-            <w:r>
-              <w:rPr>
-                <w:sz w:val="24"/>
-                <w:szCs w:val="24"/>
-              </w:rPr>
-              <w:t xml:space="preserve"/>
-            </w:r>
-          </w:p>
-        </w:tc>
-        <w:tc>
-          <w:tcPr>
-            <w:tcW w:type="dxa" w:w="4519"/>
-            <w:tcBorders>
-              <w:top w:val="none" w:color="FFFFFF" w:sz="0"/>
-              <w:left w:val="none" w:color="FFFFFF" w:sz="0"/>
-              <w:bottom w:val="none" w:color="FFFFFF" w:sz="0"/>
-              <w:right w:val="none" w:color="FFFFFF" w:sz="0"/>
-            </w:tcBorders>
-          </w:tcPr>
-          <w:p>
-            <w:pPr>
-              <w:spacing w:after="40"/>
+              <w:spacing w:after="80"/>
               <w:jc w:val="left"/>
             </w:pPr>
             <w:r>
@@ -2251,7 +2215,7 @@
           </w:p>
           <w:p>
             <w:pPr>
-              <w:spacing w:after="40"/>
+              <w:spacing w:after="80"/>
               <w:jc w:val="left"/>
             </w:pPr>
             <w:r>
@@ -2264,7 +2228,7 @@
           </w:p>
           <w:p>
             <w:pPr>
-              <w:spacing w:after="40"/>
+              <w:spacing w:after="80"/>
               <w:jc w:val="left"/>
             </w:pPr>
             <w:r>
@@ -2449,12 +2413,12 @@
     </w:p>
     <w:p>
       <w:pPr>
-        <w:spacing w:after="300"/>
-      </w:pPr>
-    </w:p>
-    <w:p>
-      <w:pPr>
-        <w:spacing w:after="40"/>
+        <w:spacing w:after="480"/>
+      </w:pPr>
+    </w:p>
+    <w:p>
+      <w:pPr>
+        <w:spacing w:after="240" w:before="0"/>
         <w:jc w:val="left"/>
       </w:pPr>
       <w:r>
@@ -2468,34 +2432,28 @@
     <w:tbl>
       <w:tblPr>
         <w:tblW w:type="dxa" w:w="9638"/>
+        <w:tblLayout w:type="fixed"/>
         <w:tblBorders>
-          <w:top w:val="none" w:color="FFFFFF" w:sz="0"/>
-          <w:left w:val="none" w:color="FFFFFF" w:sz="0"/>
-          <w:bottom w:val="none" w:color="FFFFFF" w:sz="0"/>
-          <w:right w:val="none" w:color="FFFFFF" w:sz="0"/>
-          <w:insideH w:val="single" w:color="auto" w:sz="4"/>
-          <w:insideV w:val="single" w:color="auto" w:sz="4"/>
+          <w:top w:val="none" w:sz="0" w:space="0" w:color="auto"/>
+          <w:left w:val="none" w:sz="0" w:space="0" w:color="auto"/>
+          <w:bottom w:val="none" w:sz="0" w:space="0" w:color="auto"/>
+          <w:right w:val="none" w:sz="0" w:space="0" w:color="auto"/>
+          <w:insideH w:val="none" w:sz="0" w:space="0" w:color="auto"/>
+          <w:insideV w:val="none" w:sz="0" w:space="0" w:color="auto"/>
         </w:tblBorders>
       </w:tblPr>
       <w:tblGrid>
-        <w:gridCol w:w="100"/>
-        <w:gridCol w:w="100"/>
-        <w:gridCol w:w="100"/>
+        <w:gridCol w:w="4819"/>
+        <w:gridCol w:w="4819"/>
       </w:tblGrid>
       <w:tr>
         <w:tc>
           <w:tcPr>
-            <w:tcW w:type="dxa" w:w="4519"/>
-            <w:tcBorders>
-              <w:top w:val="none" w:color="FFFFFF" w:sz="0"/>
-              <w:left w:val="none" w:color="FFFFFF" w:sz="0"/>
-              <w:bottom w:val="none" w:color="FFFFFF" w:sz="0"/>
-              <w:right w:val="none" w:color="FFFFFF" w:sz="0"/>
-            </w:tcBorders>
+            <w:tcW w:type="dxa" w:w="4819"/>
           </w:tcPr>
           <w:p>
             <w:pPr>
-              <w:spacing w:after="40"/>
+              <w:spacing w:after="80"/>
               <w:jc w:val="left"/>
             </w:pPr>
             <w:r>
@@ -2508,7 +2466,7 @@
           </w:p>
           <w:p>
             <w:pPr>
-              <w:spacing w:after="40"/>
+              <w:spacing w:after="80"/>
               <w:jc w:val="left"/>
             </w:pPr>
             <w:r>
@@ -2521,7 +2479,7 @@
           </w:p>
           <w:p>
             <w:pPr>
-              <w:spacing w:after="40"/>
+              <w:spacing w:after="80"/>
               <w:jc w:val="left"/>
             </w:pPr>
             <w:r>
@@ -2535,41 +2493,11 @@
         </w:tc>
         <w:tc>
           <w:tcPr>
-            <w:tcW w:type="dxa" w:w="600"/>
-            <w:tcBorders>
-              <w:top w:val="none" w:color="FFFFFF" w:sz="0"/>
-              <w:left w:val="none" w:color="FFFFFF" w:sz="0"/>
-              <w:bottom w:val="none" w:color="FFFFFF" w:sz="0"/>
-              <w:right w:val="none" w:color="FFFFFF" w:sz="0"/>
-            </w:tcBorders>
+            <w:tcW w:type="dxa" w:w="4819"/>
           </w:tcPr>
           <w:p>
             <w:pPr>
-              <w:spacing w:after="40"/>
-              <w:jc w:val="left"/>
-            </w:pPr>
-            <w:r>
-              <w:rPr>
-                <w:sz w:val="24"/>
-                <w:szCs w:val="24"/>
-              </w:rPr>
-              <w:t xml:space="preserve"/>
-            </w:r>
-          </w:p>
-        </w:tc>
-        <w:tc>
-          <w:tcPr>
-            <w:tcW w:type="dxa" w:w="4519"/>
-            <w:tcBorders>
-              <w:top w:val="none" w:color="FFFFFF" w:sz="0"/>
-              <w:left w:val="none" w:color="FFFFFF" w:sz="0"/>
-              <w:bottom w:val="none" w:color="FFFFFF" w:sz="0"/>
-              <w:right w:val="none" w:color="FFFFFF" w:sz="0"/>
-            </w:tcBorders>
-          </w:tcPr>
-          <w:p>
-            <w:pPr>
-              <w:spacing w:after="40"/>
+              <w:spacing w:after="80"/>
               <w:jc w:val="left"/>
             </w:pPr>
             <w:r>
@@ -2582,7 +2510,7 @@
           </w:p>
           <w:p>
             <w:pPr>
-              <w:spacing w:after="40"/>
+              <w:spacing w:after="80"/>
               <w:jc w:val="left"/>
             </w:pPr>
             <w:r>
@@ -2595,7 +2523,7 @@
           </w:p>
           <w:p>
             <w:pPr>
-              <w:spacing w:after="40"/>
+              <w:spacing w:after="80"/>
               <w:jc w:val="left"/>
             </w:pPr>
             <w:r>
@@ -2695,34 +2623,28 @@
     <w:tbl>
       <w:tblPr>
         <w:tblW w:type="dxa" w:w="9638"/>
+        <w:tblLayout w:type="fixed"/>
         <w:tblBorders>
-          <w:top w:val="none" w:color="FFFFFF" w:sz="0"/>
-          <w:left w:val="none" w:color="FFFFFF" w:sz="0"/>
-          <w:bottom w:val="none" w:color="FFFFFF" w:sz="0"/>
-          <w:right w:val="none" w:color="FFFFFF" w:sz="0"/>
-          <w:insideH w:val="single" w:color="auto" w:sz="4"/>
-          <w:insideV w:val="single" w:color="auto" w:sz="4"/>
+          <w:top w:val="none" w:sz="0" w:space="0" w:color="auto"/>
+          <w:left w:val="none" w:sz="0" w:space="0" w:color="auto"/>
+          <w:bottom w:val="none" w:sz="0" w:space="0" w:color="auto"/>
+          <w:right w:val="none" w:sz="0" w:space="0" w:color="auto"/>
+          <w:insideH w:val="none" w:sz="0" w:space="0" w:color="auto"/>
+          <w:insideV w:val="none" w:sz="0" w:space="0" w:color="auto"/>
         </w:tblBorders>
       </w:tblPr>
       <w:tblGrid>
-        <w:gridCol w:w="100"/>
-        <w:gridCol w:w="100"/>
-        <w:gridCol w:w="100"/>
+        <w:gridCol w:w="4819"/>
+        <w:gridCol w:w="4819"/>
       </w:tblGrid>
       <w:tr>
         <w:tc>
           <w:tcPr>
-            <w:tcW w:type="dxa" w:w="4519"/>
-            <w:tcBorders>
-              <w:top w:val="none" w:color="FFFFFF" w:sz="0"/>
-              <w:left w:val="none" w:color="FFFFFF" w:sz="0"/>
-              <w:bottom w:val="none" w:color="FFFFFF" w:sz="0"/>
-              <w:right w:val="none" w:color="FFFFFF" w:sz="0"/>
-            </w:tcBorders>
+            <w:tcW w:type="dxa" w:w="4819"/>
           </w:tcPr>
           <w:p>
             <w:pPr>
-              <w:spacing w:after="40"/>
+              <w:spacing w:after="80"/>
               <w:jc w:val="left"/>
             </w:pPr>
             <w:r>
@@ -2735,7 +2657,7 @@
           </w:p>
           <w:p>
             <w:pPr>
-              <w:spacing w:after="40"/>
+              <w:spacing w:after="80"/>
               <w:jc w:val="left"/>
             </w:pPr>
             <w:r>
@@ -2748,7 +2670,7 @@
           </w:p>
           <w:p>
             <w:pPr>
-              <w:spacing w:after="40"/>
+              <w:spacing w:after="80"/>
               <w:jc w:val="left"/>
             </w:pPr>
             <w:r>
@@ -2762,41 +2684,11 @@
         </w:tc>
         <w:tc>
           <w:tcPr>
-            <w:tcW w:type="dxa" w:w="600"/>
-            <w:tcBorders>
-              <w:top w:val="none" w:color="FFFFFF" w:sz="0"/>
-              <w:left w:val="none" w:color="FFFFFF" w:sz="0"/>
-              <w:bottom w:val="none" w:color="FFFFFF" w:sz="0"/>
-              <w:right w:val="none" w:color="FFFFFF" w:sz="0"/>
-            </w:tcBorders>
+            <w:tcW w:type="dxa" w:w="4819"/>
           </w:tcPr>
           <w:p>
             <w:pPr>
-              <w:spacing w:after="40"/>
-              <w:jc w:val="left"/>
-            </w:pPr>
-            <w:r>
-              <w:rPr>
-                <w:sz w:val="24"/>
-                <w:szCs w:val="24"/>
-              </w:rPr>
-              <w:t xml:space="preserve"/>
-            </w:r>
-          </w:p>
-        </w:tc>
-        <w:tc>
-          <w:tcPr>
-            <w:tcW w:type="dxa" w:w="4519"/>
-            <w:tcBorders>
-              <w:top w:val="none" w:color="FFFFFF" w:sz="0"/>
-              <w:left w:val="none" w:color="FFFFFF" w:sz="0"/>
-              <w:bottom w:val="none" w:color="FFFFFF" w:sz="0"/>
-              <w:right w:val="none" w:color="FFFFFF" w:sz="0"/>
-            </w:tcBorders>
-          </w:tcPr>
-          <w:p>
-            <w:pPr>
-              <w:spacing w:after="40"/>
+              <w:spacing w:after="80"/>
               <w:jc w:val="left"/>
             </w:pPr>
             <w:r>
@@ -2809,7 +2701,7 @@
           </w:p>
           <w:p>
             <w:pPr>
-              <w:spacing w:after="40"/>
+              <w:spacing w:after="80"/>
               <w:jc w:val="left"/>
             </w:pPr>
             <w:r>
@@ -2822,7 +2714,7 @@
           </w:p>
           <w:p>
             <w:pPr>
-              <w:spacing w:after="40"/>
+              <w:spacing w:after="80"/>
               <w:jc w:val="left"/>
             </w:pPr>
             <w:r>
@@ -3007,12 +2899,12 @@
     </w:p>
     <w:p>
       <w:pPr>
-        <w:spacing w:after="300"/>
-      </w:pPr>
-    </w:p>
-    <w:p>
-      <w:pPr>
-        <w:spacing w:after="40"/>
+        <w:spacing w:after="480"/>
+      </w:pPr>
+    </w:p>
+    <w:p>
+      <w:pPr>
+        <w:spacing w:after="240" w:before="0"/>
         <w:jc w:val="left"/>
       </w:pPr>
       <w:r>
@@ -3026,34 +2918,28 @@
     <w:tbl>
       <w:tblPr>
         <w:tblW w:type="dxa" w:w="9638"/>
+        <w:tblLayout w:type="fixed"/>
         <w:tblBorders>
-          <w:top w:val="none" w:color="FFFFFF" w:sz="0"/>
-          <w:left w:val="none" w:color="FFFFFF" w:sz="0"/>
-          <w:bottom w:val="none" w:color="FFFFFF" w:sz="0"/>
-          <w:right w:val="none" w:color="FFFFFF" w:sz="0"/>
-          <w:insideH w:val="single" w:color="auto" w:sz="4"/>
-          <w:insideV w:val="single" w:color="auto" w:sz="4"/>
+          <w:top w:val="none" w:sz="0" w:space="0" w:color="auto"/>
+          <w:left w:val="none" w:sz="0" w:space="0" w:color="auto"/>
+          <w:bottom w:val="none" w:sz="0" w:space="0" w:color="auto"/>
+          <w:right w:val="none" w:sz="0" w:space="0" w:color="auto"/>
+          <w:insideH w:val="none" w:sz="0" w:space="0" w:color="auto"/>
+          <w:insideV w:val="none" w:sz="0" w:space="0" w:color="auto"/>
         </w:tblBorders>
       </w:tblPr>
       <w:tblGrid>
-        <w:gridCol w:w="100"/>
-        <w:gridCol w:w="100"/>
-        <w:gridCol w:w="100"/>
+        <w:gridCol w:w="4819"/>
+        <w:gridCol w:w="4819"/>
       </w:tblGrid>
       <w:tr>
         <w:tc>
           <w:tcPr>
-            <w:tcW w:type="dxa" w:w="4519"/>
-            <w:tcBorders>
-              <w:top w:val="none" w:color="FFFFFF" w:sz="0"/>
-              <w:left w:val="none" w:color="FFFFFF" w:sz="0"/>
-              <w:bottom w:val="none" w:color="FFFFFF" w:sz="0"/>
-              <w:right w:val="none" w:color="FFFFFF" w:sz="0"/>
-            </w:tcBorders>
+            <w:tcW w:type="dxa" w:w="4819"/>
           </w:tcPr>
           <w:p>
             <w:pPr>
-              <w:spacing w:after="40"/>
+              <w:spacing w:after="80"/>
               <w:jc w:val="left"/>
             </w:pPr>
             <w:r>
@@ -3066,7 +2952,7 @@
           </w:p>
           <w:p>
             <w:pPr>
-              <w:spacing w:after="40"/>
+              <w:spacing w:after="80"/>
               <w:jc w:val="left"/>
             </w:pPr>
             <w:r>
@@ -3079,7 +2965,7 @@
           </w:p>
           <w:p>
             <w:pPr>
-              <w:spacing w:after="40"/>
+              <w:spacing w:after="80"/>
               <w:jc w:val="left"/>
             </w:pPr>
             <w:r>
@@ -3092,7 +2978,7 @@
           </w:p>
           <w:p>
             <w:pPr>
-              <w:spacing w:after="40"/>
+              <w:spacing w:after="80"/>
               <w:jc w:val="left"/>
             </w:pPr>
             <w:r>
@@ -3105,7 +2991,7 @@
           </w:p>
           <w:p>
             <w:pPr>
-              <w:spacing w:after="40"/>
+              <w:spacing w:after="80"/>
               <w:jc w:val="left"/>
             </w:pPr>
             <w:r>
@@ -3118,7 +3004,7 @@
           </w:p>
           <w:p>
             <w:pPr>
-              <w:spacing w:after="40"/>
+              <w:spacing w:after="80"/>
               <w:jc w:val="left"/>
             </w:pPr>
             <w:r>
@@ -3132,41 +3018,11 @@
         </w:tc>
         <w:tc>
           <w:tcPr>
-            <w:tcW w:type="dxa" w:w="600"/>
-            <w:tcBorders>
-              <w:top w:val="none" w:color="FFFFFF" w:sz="0"/>
-              <w:left w:val="none" w:color="FFFFFF" w:sz="0"/>
-              <w:bottom w:val="none" w:color="FFFFFF" w:sz="0"/>
-              <w:right w:val="none" w:color="FFFFFF" w:sz="0"/>
-            </w:tcBorders>
+            <w:tcW w:type="dxa" w:w="4819"/>
           </w:tcPr>
           <w:p>
             <w:pPr>
-              <w:spacing w:after="40"/>
-              <w:jc w:val="left"/>
-            </w:pPr>
-            <w:r>
-              <w:rPr>
-                <w:sz w:val="24"/>
-                <w:szCs w:val="24"/>
-              </w:rPr>
-              <w:t xml:space="preserve"/>
-            </w:r>
-          </w:p>
-        </w:tc>
-        <w:tc>
-          <w:tcPr>
-            <w:tcW w:type="dxa" w:w="4519"/>
-            <w:tcBorders>
-              <w:top w:val="none" w:color="FFFFFF" w:sz="0"/>
-              <w:left w:val="none" w:color="FFFFFF" w:sz="0"/>
-              <w:bottom w:val="none" w:color="FFFFFF" w:sz="0"/>
-              <w:right w:val="none" w:color="FFFFFF" w:sz="0"/>
-            </w:tcBorders>
-          </w:tcPr>
-          <w:p>
-            <w:pPr>
-              <w:spacing w:after="40"/>
+              <w:spacing w:after="80"/>
               <w:jc w:val="left"/>
             </w:pPr>
             <w:r>
@@ -3179,7 +3035,7 @@
           </w:p>
           <w:p>
             <w:pPr>
-              <w:spacing w:after="40"/>
+              <w:spacing w:after="80"/>
               <w:jc w:val="left"/>
             </w:pPr>
             <w:r>
@@ -3192,7 +3048,7 @@
           </w:p>
           <w:p>
             <w:pPr>
-              <w:spacing w:after="40"/>
+              <w:spacing w:after="80"/>
               <w:jc w:val="left"/>
             </w:pPr>
             <w:r>
@@ -3205,7 +3061,7 @@
           </w:p>
           <w:p>
             <w:pPr>
-              <w:spacing w:after="40"/>
+              <w:spacing w:after="80"/>
               <w:jc w:val="left"/>
             </w:pPr>
             <w:r>
@@ -3218,7 +3074,7 @@
           </w:p>
           <w:p>
             <w:pPr>
-              <w:spacing w:after="40"/>
+              <w:spacing w:after="80"/>
               <w:jc w:val="left"/>
             </w:pPr>
             <w:r>
@@ -3231,7 +3087,7 @@
           </w:p>
           <w:p>
             <w:pPr>
-              <w:spacing w:after="40"/>
+              <w:spacing w:after="80"/>
               <w:jc w:val="left"/>
             </w:pPr>
             <w:r>
@@ -3385,34 +3241,28 @@
     <w:tbl>
       <w:tblPr>
         <w:tblW w:type="dxa" w:w="9638"/>
+        <w:tblLayout w:type="fixed"/>
         <w:tblBorders>
-          <w:top w:val="none" w:color="FFFFFF" w:sz="0"/>
-          <w:left w:val="none" w:color="FFFFFF" w:sz="0"/>
-          <w:bottom w:val="none" w:color="FFFFFF" w:sz="0"/>
-          <w:right w:val="none" w:color="FFFFFF" w:sz="0"/>
-          <w:insideH w:val="single" w:color="auto" w:sz="4"/>
-          <w:insideV w:val="single" w:color="auto" w:sz="4"/>
+          <w:top w:val="none" w:sz="0" w:space="0" w:color="auto"/>
+          <w:left w:val="none" w:sz="0" w:space="0" w:color="auto"/>
+          <w:bottom w:val="none" w:sz="0" w:space="0" w:color="auto"/>
+          <w:right w:val="none" w:sz="0" w:space="0" w:color="auto"/>
+          <w:insideH w:val="none" w:sz="0" w:space="0" w:color="auto"/>
+          <w:insideV w:val="none" w:sz="0" w:space="0" w:color="auto"/>
         </w:tblBorders>
       </w:tblPr>
       <w:tblGrid>
-        <w:gridCol w:w="100"/>
-        <w:gridCol w:w="100"/>
-        <w:gridCol w:w="100"/>
+        <w:gridCol w:w="4819"/>
+        <w:gridCol w:w="4819"/>
       </w:tblGrid>
       <w:tr>
         <w:tc>
           <w:tcPr>
-            <w:tcW w:type="dxa" w:w="4519"/>
-            <w:tcBorders>
-              <w:top w:val="none" w:color="FFFFFF" w:sz="0"/>
-              <w:left w:val="none" w:color="FFFFFF" w:sz="0"/>
-              <w:bottom w:val="none" w:color="FFFFFF" w:sz="0"/>
-              <w:right w:val="none" w:color="FFFFFF" w:sz="0"/>
-            </w:tcBorders>
+            <w:tcW w:type="dxa" w:w="4819"/>
           </w:tcPr>
           <w:p>
             <w:pPr>
-              <w:spacing w:after="40"/>
+              <w:spacing w:after="80"/>
               <w:jc w:val="left"/>
             </w:pPr>
             <w:r>
@@ -3425,7 +3275,7 @@
           </w:p>
           <w:p>
             <w:pPr>
-              <w:spacing w:after="40"/>
+              <w:spacing w:after="80"/>
               <w:jc w:val="left"/>
             </w:pPr>
             <w:r>
@@ -3438,7 +3288,7 @@
           </w:p>
           <w:p>
             <w:pPr>
-              <w:spacing w:after="40"/>
+              <w:spacing w:after="80"/>
               <w:jc w:val="left"/>
             </w:pPr>
             <w:r>
@@ -3452,41 +3302,11 @@
         </w:tc>
         <w:tc>
           <w:tcPr>
-            <w:tcW w:type="dxa" w:w="600"/>
-            <w:tcBorders>
-              <w:top w:val="none" w:color="FFFFFF" w:sz="0"/>
-              <w:left w:val="none" w:color="FFFFFF" w:sz="0"/>
-              <w:bottom w:val="none" w:color="FFFFFF" w:sz="0"/>
-              <w:right w:val="none" w:color="FFFFFF" w:sz="0"/>
-            </w:tcBorders>
+            <w:tcW w:type="dxa" w:w="4819"/>
           </w:tcPr>
           <w:p>
             <w:pPr>
-              <w:spacing w:after="40"/>
-              <w:jc w:val="left"/>
-            </w:pPr>
-            <w:r>
-              <w:rPr>
-                <w:sz w:val="24"/>
-                <w:szCs w:val="24"/>
-              </w:rPr>
-              <w:t xml:space="preserve"/>
-            </w:r>
-          </w:p>
-        </w:tc>
-        <w:tc>
-          <w:tcPr>
-            <w:tcW w:type="dxa" w:w="4519"/>
-            <w:tcBorders>
-              <w:top w:val="none" w:color="FFFFFF" w:sz="0"/>
-              <w:left w:val="none" w:color="FFFFFF" w:sz="0"/>
-              <w:bottom w:val="none" w:color="FFFFFF" w:sz="0"/>
-              <w:right w:val="none" w:color="FFFFFF" w:sz="0"/>
-            </w:tcBorders>
-          </w:tcPr>
-          <w:p>
-            <w:pPr>
-              <w:spacing w:after="40"/>
+              <w:spacing w:after="80"/>
               <w:jc w:val="left"/>
             </w:pPr>
             <w:r>
@@ -3499,7 +3319,7 @@
           </w:p>
           <w:p>
             <w:pPr>
-              <w:spacing w:after="40"/>
+              <w:spacing w:after="80"/>
               <w:jc w:val="left"/>
             </w:pPr>
             <w:r>
@@ -3512,7 +3332,7 @@
           </w:p>
           <w:p>
             <w:pPr>
-              <w:spacing w:after="40"/>
+              <w:spacing w:after="80"/>
               <w:jc w:val="left"/>
             </w:pPr>
             <w:r>
@@ -3697,12 +3517,12 @@
     </w:p>
     <w:p>
       <w:pPr>
-        <w:spacing w:after="200"/>
-      </w:pPr>
-    </w:p>
-    <w:p>
-      <w:pPr>
-        <w:spacing w:after="40"/>
+        <w:spacing w:after="480"/>
+      </w:pPr>
+    </w:p>
+    <w:p>
+      <w:pPr>
+        <w:spacing w:after="240" w:before="0"/>
         <w:jc w:val="left"/>
       </w:pPr>
       <w:r>
@@ -3716,34 +3536,28 @@
     <w:tbl>
       <w:tblPr>
         <w:tblW w:type="dxa" w:w="9638"/>
+        <w:tblLayout w:type="fixed"/>
         <w:tblBorders>
-          <w:top w:val="none" w:color="FFFFFF" w:sz="0"/>
-          <w:left w:val="none" w:color="FFFFFF" w:sz="0"/>
-          <w:bottom w:val="none" w:color="FFFFFF" w:sz="0"/>
-          <w:right w:val="none" w:color="FFFFFF" w:sz="0"/>
-          <w:insideH w:val="single" w:color="auto" w:sz="4"/>
-          <w:insideV w:val="single" w:color="auto" w:sz="4"/>
+          <w:top w:val="none" w:sz="0" w:space="0" w:color="auto"/>
+          <w:left w:val="none" w:sz="0" w:space="0" w:color="auto"/>
+          <w:bottom w:val="none" w:sz="0" w:space="0" w:color="auto"/>
+          <w:right w:val="none" w:sz="0" w:space="0" w:color="auto"/>
+          <w:insideH w:val="none" w:sz="0" w:space="0" w:color="auto"/>
+          <w:insideV w:val="none" w:sz="0" w:space="0" w:color="auto"/>
         </w:tblBorders>
       </w:tblPr>
       <w:tblGrid>
-        <w:gridCol w:w="100"/>
-        <w:gridCol w:w="100"/>
-        <w:gridCol w:w="100"/>
+        <w:gridCol w:w="4819"/>
+        <w:gridCol w:w="4819"/>
       </w:tblGrid>
       <w:tr>
         <w:tc>
           <w:tcPr>
-            <w:tcW w:type="dxa" w:w="4519"/>
-            <w:tcBorders>
-              <w:top w:val="none" w:color="FFFFFF" w:sz="0"/>
-              <w:left w:val="none" w:color="FFFFFF" w:sz="0"/>
-              <w:bottom w:val="none" w:color="FFFFFF" w:sz="0"/>
-              <w:right w:val="none" w:color="FFFFFF" w:sz="0"/>
-            </w:tcBorders>
+            <w:tcW w:type="dxa" w:w="4819"/>
           </w:tcPr>
           <w:p>
             <w:pPr>
-              <w:spacing w:after="40"/>
+              <w:spacing w:after="80"/>
               <w:jc w:val="left"/>
             </w:pPr>
             <w:r>
@@ -3757,41 +3571,11 @@
         </w:tc>
         <w:tc>
           <w:tcPr>
-            <w:tcW w:type="dxa" w:w="600"/>
-            <w:tcBorders>
-              <w:top w:val="none" w:color="FFFFFF" w:sz="0"/>
-              <w:left w:val="none" w:color="FFFFFF" w:sz="0"/>
-              <w:bottom w:val="none" w:color="FFFFFF" w:sz="0"/>
-              <w:right w:val="none" w:color="FFFFFF" w:sz="0"/>
-            </w:tcBorders>
+            <w:tcW w:type="dxa" w:w="4819"/>
           </w:tcPr>
           <w:p>
             <w:pPr>
-              <w:spacing w:after="40"/>
-              <w:jc w:val="left"/>
-            </w:pPr>
-            <w:r>
-              <w:rPr>
-                <w:sz w:val="24"/>
-                <w:szCs w:val="24"/>
-              </w:rPr>
-              <w:t xml:space="preserve"/>
-            </w:r>
-          </w:p>
-        </w:tc>
-        <w:tc>
-          <w:tcPr>
-            <w:tcW w:type="dxa" w:w="4519"/>
-            <w:tcBorders>
-              <w:top w:val="none" w:color="FFFFFF" w:sz="0"/>
-              <w:left w:val="none" w:color="FFFFFF" w:sz="0"/>
-              <w:bottom w:val="none" w:color="FFFFFF" w:sz="0"/>
-              <w:right w:val="none" w:color="FFFFFF" w:sz="0"/>
-            </w:tcBorders>
-          </w:tcPr>
-          <w:p>
-            <w:pPr>
-              <w:spacing w:after="40"/>
+              <w:spacing w:after="80"/>
               <w:jc w:val="left"/>
             </w:pPr>
             <w:r>

</xml_diff>

<commit_message>
feat: módulo Pensão por Morte — wizard, card UI, geração de documentos e fallback DOCX
- PensaoMorteCard com formulário completo: instituidor, dependentes, representação legal
- API GET/POST /api/processos/[id]/pensao-morte com soft-delete e validação Zod
- Wizard: Pensão por Morte como 4º tipo de benefício; MEI inativo excluído do cenário
- Step 3 (Situações): card "Nenhuma situação especial" pré-selecionado melhora UX
- Geração de documentos entrega DOCX quando PDF_CONVERTER_API_KEY não está configurada
- Download detecta extensão real (.docx/.pdf) e serve Content-Type correto
- Templates 14 (Termo de Representação INSS) e 15 (Termo de Responsabilidade) adicionados
- Cadeia documental e template-context estendidos para Pensão por Morte
- Migrations 014-019: tabelas instituidores, dependentes_habilitados, representacoes_legais
- Documentos de referência adicionados em docs/referencia_pensao_por_morte/

Co-Authored-By: Claude Sonnet 4.6 <noreply@anthropic.com>
</commit_message>
<xml_diff>
--- a/templates/01_contrato_bpc_adulto.docx
+++ b/templates/01_contrato_bpc_adulto.docx
@@ -252,6 +252,69 @@
           <w:sz w:val="24"/>
           <w:szCs w:val="24"/>
         </w:rPr>
+        <w:t xml:space="preserve">{#processo.eh_pensao_morte}</w:t>
+      </w:r>
+      <w:r>
+        <w:rPr>
+          <w:sz w:val="24"/>
+          <w:szCs w:val="24"/>
+        </w:rPr>
+        <w:t xml:space="preserve">, na qualidade de </w:t>
+      </w:r>
+      <w:r>
+        <w:rPr>
+          <w:sz w:val="24"/>
+          <w:szCs w:val="24"/>
+        </w:rPr>
+        <w:t xml:space="preserve">{dependente_titular.relacao_com_instituidor_descricao}</w:t>
+      </w:r>
+      <w:r>
+        <w:rPr>
+          <w:sz w:val="24"/>
+          <w:szCs w:val="24"/>
+        </w:rPr>
+        <w:t xml:space="preserve"> de </w:t>
+      </w:r>
+      <w:r>
+        <w:rPr>
+          <w:sz w:val="24"/>
+          <w:szCs w:val="24"/>
+        </w:rPr>
+        <w:t xml:space="preserve">{instituidor.nome_completo}</w:t>
+      </w:r>
+      <w:r>
+        <w:rPr>
+          <w:sz w:val="24"/>
+          <w:szCs w:val="24"/>
+        </w:rPr>
+        <w:t xml:space="preserve"> (falecido em </w:t>
+      </w:r>
+      <w:r>
+        <w:rPr>
+          <w:sz w:val="24"/>
+          <w:szCs w:val="24"/>
+        </w:rPr>
+        <w:t xml:space="preserve">{instituidor.data_obito}</w:t>
+      </w:r>
+      <w:r>
+        <w:rPr>
+          <w:sz w:val="24"/>
+          <w:szCs w:val="24"/>
+        </w:rPr>
+        <w:t xml:space="preserve">)</w:t>
+      </w:r>
+      <w:r>
+        <w:rPr>
+          <w:sz w:val="24"/>
+          <w:szCs w:val="24"/>
+        </w:rPr>
+        <w:t xml:space="preserve">{/processo.eh_pensao_morte}</w:t>
+      </w:r>
+      <w:r>
+        <w:rPr>
+          <w:sz w:val="24"/>
+          <w:szCs w:val="24"/>
+        </w:rPr>
         <w:t xml:space="preserve">;</w:t>
       </w:r>
     </w:p>
@@ -487,6 +550,69 @@
           <w:sz w:val="24"/>
           <w:szCs w:val="24"/>
         </w:rPr>
+        <w:t xml:space="preserve">{#processo.eh_pensao_morte}</w:t>
+      </w:r>
+      <w:r>
+        <w:rPr>
+          <w:sz w:val="24"/>
+          <w:szCs w:val="24"/>
+        </w:rPr>
+        <w:t xml:space="preserve">, na qualidade de </w:t>
+      </w:r>
+      <w:r>
+        <w:rPr>
+          <w:sz w:val="24"/>
+          <w:szCs w:val="24"/>
+        </w:rPr>
+        <w:t xml:space="preserve">{dependente_titular.relacao_com_instituidor_descricao}</w:t>
+      </w:r>
+      <w:r>
+        <w:rPr>
+          <w:sz w:val="24"/>
+          <w:szCs w:val="24"/>
+        </w:rPr>
+        <w:t xml:space="preserve"> de </w:t>
+      </w:r>
+      <w:r>
+        <w:rPr>
+          <w:sz w:val="24"/>
+          <w:szCs w:val="24"/>
+        </w:rPr>
+        <w:t xml:space="preserve">{instituidor.nome_completo}</w:t>
+      </w:r>
+      <w:r>
+        <w:rPr>
+          <w:sz w:val="24"/>
+          <w:szCs w:val="24"/>
+        </w:rPr>
+        <w:t xml:space="preserve"> (falecido em </w:t>
+      </w:r>
+      <w:r>
+        <w:rPr>
+          <w:sz w:val="24"/>
+          <w:szCs w:val="24"/>
+        </w:rPr>
+        <w:t xml:space="preserve">{instituidor.data_obito}</w:t>
+      </w:r>
+      <w:r>
+        <w:rPr>
+          <w:sz w:val="24"/>
+          <w:szCs w:val="24"/>
+        </w:rPr>
+        <w:t xml:space="preserve">)</w:t>
+      </w:r>
+      <w:r>
+        <w:rPr>
+          <w:sz w:val="24"/>
+          <w:szCs w:val="24"/>
+        </w:rPr>
+        <w:t xml:space="preserve">{/processo.eh_pensao_morte}</w:t>
+      </w:r>
+      <w:r>
+        <w:rPr>
+          <w:sz w:val="24"/>
+          <w:szCs w:val="24"/>
+        </w:rPr>
         <w:t xml:space="preserve">, ASSINO, conjuntamente, com duas Testemunhas (A ROGO) abaixo;</w:t>
       </w:r>
     </w:p>
@@ -765,6 +891,69 @@
           <w:szCs w:val="24"/>
         </w:rPr>
         <w:t xml:space="preserve">{endereco.cep}</w:t>
+      </w:r>
+      <w:r>
+        <w:rPr>
+          <w:sz w:val="24"/>
+          <w:szCs w:val="24"/>
+        </w:rPr>
+        <w:t xml:space="preserve">{#processo.eh_pensao_morte}</w:t>
+      </w:r>
+      <w:r>
+        <w:rPr>
+          <w:sz w:val="24"/>
+          <w:szCs w:val="24"/>
+        </w:rPr>
+        <w:t xml:space="preserve">, na qualidade de </w:t>
+      </w:r>
+      <w:r>
+        <w:rPr>
+          <w:sz w:val="24"/>
+          <w:szCs w:val="24"/>
+        </w:rPr>
+        <w:t xml:space="preserve">{dependente_titular.relacao_com_instituidor_descricao}</w:t>
+      </w:r>
+      <w:r>
+        <w:rPr>
+          <w:sz w:val="24"/>
+          <w:szCs w:val="24"/>
+        </w:rPr>
+        <w:t xml:space="preserve"> de </w:t>
+      </w:r>
+      <w:r>
+        <w:rPr>
+          <w:sz w:val="24"/>
+          <w:szCs w:val="24"/>
+        </w:rPr>
+        <w:t xml:space="preserve">{instituidor.nome_completo}</w:t>
+      </w:r>
+      <w:r>
+        <w:rPr>
+          <w:sz w:val="24"/>
+          <w:szCs w:val="24"/>
+        </w:rPr>
+        <w:t xml:space="preserve"> (falecido em </w:t>
+      </w:r>
+      <w:r>
+        <w:rPr>
+          <w:sz w:val="24"/>
+          <w:szCs w:val="24"/>
+        </w:rPr>
+        <w:t xml:space="preserve">{instituidor.data_obito}</w:t>
+      </w:r>
+      <w:r>
+        <w:rPr>
+          <w:sz w:val="24"/>
+          <w:szCs w:val="24"/>
+        </w:rPr>
+        <w:t xml:space="preserve">)</w:t>
+      </w:r>
+      <w:r>
+        <w:rPr>
+          <w:sz w:val="24"/>
+          <w:szCs w:val="24"/>
+        </w:rPr>
+        <w:t xml:space="preserve">{/processo.eh_pensao_morte}</w:t>
       </w:r>
       <w:r>
         <w:rPr>

</xml_diff>

<commit_message>
fix: número da residência passa a ser opcional no cadastro de clientes
- Remove validação obrigatória (min 1) do campo endereco_numero no clientSchema
- Adiciona campo numero_nro_formatado ao TemplateContext: inclui ", Nº X" quando preenchido, vazio quando ausente
- Atualiza todos os templates DOCX (01-08, 10, 14) para usar {endereco.numero_nro_formatado} em vez de ", Nº {endereco.numero}" — nenhuma pontuação solta quando número não informado
- PDF do Termo de Representação INSS já tratava numero vazio via filter(Boolean)

Co-Authored-By: Claude Sonnet 4.6 <noreply@anthropic.com>
</commit_message>
<xml_diff>
--- a/templates/01_contrato_bpc_adulto.docx
+++ b/templates/01_contrato_bpc_adulto.docx
@@ -175,14 +175,14 @@
           <w:sz w:val="24"/>
           <w:szCs w:val="24"/>
         </w:rPr>
-        <w:t xml:space="preserve">, Nº </w:t>
-      </w:r>
-      <w:r>
-        <w:rPr>
-          <w:sz w:val="24"/>
-          <w:szCs w:val="24"/>
-        </w:rPr>
-        <w:t xml:space="preserve">{endereco.numero}</w:t>
+        <w:t xml:space="preserve"/>
+      </w:r>
+      <w:r>
+        <w:rPr>
+          <w:sz w:val="24"/>
+          <w:szCs w:val="24"/>
+        </w:rPr>
+        <w:t xml:space="preserve">{endereco.numero_nro_formatado}</w:t>
       </w:r>
       <w:r>
         <w:rPr>
@@ -473,14 +473,14 @@
           <w:sz w:val="24"/>
           <w:szCs w:val="24"/>
         </w:rPr>
-        <w:t xml:space="preserve">, Nº </w:t>
-      </w:r>
-      <w:r>
-        <w:rPr>
-          <w:sz w:val="24"/>
-          <w:szCs w:val="24"/>
-        </w:rPr>
-        <w:t xml:space="preserve">{endereco.numero}</w:t>
+        <w:t xml:space="preserve"/>
+      </w:r>
+      <w:r>
+        <w:rPr>
+          <w:sz w:val="24"/>
+          <w:szCs w:val="24"/>
+        </w:rPr>
+        <w:t xml:space="preserve">{endereco.numero_nro_formatado}</w:t>
       </w:r>
       <w:r>
         <w:rPr>
@@ -820,14 +820,14 @@
           <w:sz w:val="24"/>
           <w:szCs w:val="24"/>
         </w:rPr>
-        <w:t xml:space="preserve">, Nº </w:t>
-      </w:r>
-      <w:r>
-        <w:rPr>
-          <w:sz w:val="24"/>
-          <w:szCs w:val="24"/>
-        </w:rPr>
-        <w:t xml:space="preserve">{endereco.numero}</w:t>
+        <w:t xml:space="preserve"/>
+      </w:r>
+      <w:r>
+        <w:rPr>
+          <w:sz w:val="24"/>
+          <w:szCs w:val="24"/>
+        </w:rPr>
+        <w:t xml:space="preserve">{endereco.numero_nro_formatado}</w:t>
       </w:r>
       <w:r>
         <w:rPr>

</xml_diff>